<commit_message>
docs: polish course paper final draft
</commit_message>
<xml_diff>
--- a/paper/course_paper_draft.docx
+++ b/paper/course_paper_draft.docx
@@ -78,7 +78,7 @@
           <w:b w:val="0"/>
           <w:sz w:val="21"/>
         </w:rPr>
-        <w:t xml:space="preserve">大型建筑央企具有项目周期长、合同资产规模高、资金结算链条长、子公司层级多和跨区域经营范围广等特征，财务风险往往不是由单一指标突然恶化造成，而是在项目履约、工程结算、应收账款、债务融资、担保承诺和合规事件之间持续传导。本文以中国中铁股份有限公司为研究对象，综合使用公开披露文件、裁判文书、执行信息、企业风险数据、信用评级报告和同业财务面板，构建“风险事件数据—风险图谱—文本风险指标—财务风险预警模型—弹性风险管理评分”的分析框架。公开披露显示，2025</w:t>
+        <w:t xml:space="preserve">大型建筑央企具有项目周期长、合同资产规模高、资金结算链条长、子公司层级多和跨区域经营范围广等特征，财务风险通常不是由单一指标突变引发，而是在项目履约、工程结算、应收账款、债务融资、担保承诺和合规事件之间持续传导。本文以中国中铁股份有限公司为研究对象，综合使用公开披露文件、裁判文书、执行信息、企业风险数据、信用评级报告和同业财务面板，构建“风险事件数据—风险图谱—文本风险指标—财务风险预警模型—弹性风险管理评分”的分析框架。公开披露显示，2025</w:t>
       </w:r>
       <w:r>
         <w:rPr>
@@ -286,7 +286,7 @@
           <w:b w:val="0"/>
           <w:sz w:val="21"/>
         </w:rPr>
-        <w:t xml:space="preserve">和</w:t>
+        <w:t xml:space="preserve">与</w:t>
       </w:r>
       <w:r>
         <w:rPr>
@@ -366,7 +366,7 @@
           <w:b w:val="0"/>
           <w:sz w:val="21"/>
         </w:rPr>
-        <w:t xml:space="preserve">财务预警基线模型；并从财务缓冲、经营缓冲、治理信用缓冲和网络韧性四个维度评价风险缓冲能力。结果表明，中国中铁的风险识别应重点关注回款与合同资产风险、债务期限与流动性风险、子公司与项目网络传导风险、诉讼执行与合规风险；模型对</w:t>
+        <w:t xml:space="preserve">财务预警基线模型；并从财务缓冲、经营缓冲、治理信用缓冲和网络韧性四个维度评价风险缓冲能力。研究表明，中国中铁的风险识别重点集中在回款与合同资产、债务期限与流动性、子公司与项目网络传导、诉讼执行与合规风险四个方面；模型对</w:t>
       </w:r>
       <w:r>
         <w:rPr>
@@ -398,7 +398,7 @@
           <w:b w:val="0"/>
           <w:sz w:val="21"/>
         </w:rPr>
-        <w:t xml:space="preserve">年经营和财务缓冲处于低位修复区间。本文结论定位于公开数据基础上的课程研究，不构成投资建议或信用评级意见。</w:t>
+        <w:t xml:space="preserve">年经营缓冲和财务缓冲处于低位修复区间。</w:t>
       </w:r>
     </w:p>
     <w:p>
@@ -445,7 +445,7 @@
           <w:b w:val="0"/>
           <w:sz w:val="21"/>
         </w:rPr>
-        <w:t xml:space="preserve">Large construction state-owned enterprises are exposed to financial risks generated by long project cycles, heavy contract assets, delayed settlements, complex subsidiary networks, debt financing and compliance events. Taking China Railway Group Limited as the case firm, this report develops an integrated framework that links public filings, legal and execution records, enterprise risk information, credit rating reports, risk graph analysis, text-based risk indicators, machine-learning early warning models and a resilience-oriented risk management scorecard. Public disclosures show that China Railway reported operating revenue of RMB 1,093.494 billion in 2025, down 5.76% year-on-year, while net profit attributable to shareholders declined by 17.91%; its operating cash flow remained positive, and the liability-to-asset ratio rose to 78.12%[1]. This report further builds a risk network with 77 nodes and 133 edges, constructs Word2Vec and jieba-based textual risk indicators, trains baseline early-warning models using a peer-firm financial panel, and evaluates resilience across financial, operating, governance-credit and network dimensions. The findings suggest that payment collection, contract assets, liquidity pressure, subsidiary-level risk propagation and litigation/compliance events should be monitored jointly. The warning-model and resilience-score results are interpreted as course-project signals based on public data, rather than investment advice or formal credit-rating conclusions.</w:t>
+        <w:t xml:space="preserve">Large construction state-owned enterprises are exposed to financial risks generated by long project cycles, heavy contract assets, delayed settlements, complex subsidiary networks, debt financing and compliance events. Taking China Railway Group Limited as the case firm, this report develops an integrated framework that links public filings, legal and execution records, enterprise risk information, credit rating reports, risk graph analysis, text-based risk indicators, machine-learning early warning models and a resilience-oriented risk management scorecard. Public disclosures show that China Railway reported operating revenue of RMB 1,093.494 billion in 2025, down 5.76% year-on-year, while net profit attributable to shareholders declined by 17.91%; its operating cash flow remained positive, and the liability-to-asset ratio rose to 78.12%[1]. This report further builds a risk network with 77 nodes and 133 edges, constructs Word2Vec and jieba-based textual risk indicators, trains baseline early-warning models using a peer-firm financial panel, and evaluates resilience across financial, operating, governance-credit and network dimensions. The results show that payment collection, contract assets, liquidity pressure, subsidiary-level risk propagation and litigation/compliance events form the main monitoring priorities, while the warning-model and resilience-score results jointly indicate higher financial pressure in 2026.</w:t>
       </w:r>
     </w:p>
     <w:p>
@@ -499,7 +499,7 @@
           <w:b w:val="0"/>
           <w:sz w:val="21"/>
         </w:rPr>
-        <w:t xml:space="preserve">基础设施建设行业兼具资金密集、项目周期长、合同关系复杂和外部政策敏感等特征。与一般制造企业相比，建筑工程企业的财务风险更容易从项目端向报表端传导：项目履约滞后可能形成结算延迟，结算延迟会推高合同资产和应收账款，回款压力进一步影响经营性现金流和短期偿债能力；若风险发生在关键子公司、核心区域或重大项目上，还可能通过担保、内部资金调拨和合并报表机制向集团层面扩散。</w:t>
+        <w:t xml:space="preserve">基础设施建设行业兼具资金密集、项目周期长、合同关系复杂和外部政策敏感等特征。与一般制造企业相比，建筑工程企业的财务风险更容易从项目端向报表端传导：项目履约滞后会延长结算周期，结算延迟会推高合同资产和应收账款，回款压力进一步影响经营性现金流和短期偿债能力；风险发生在关键子公司、核心区域或重大项目时，还会通过担保、内部资金调拨和合并报表机制向集团层面扩散。</w:t>
       </w:r>
     </w:p>
     <w:p>
@@ -579,7 +579,7 @@
           <w:b w:val="0"/>
           <w:sz w:val="21"/>
         </w:rPr>
-        <w:t xml:space="preserve">16.5%，显示其在国内建筑业总量承压背景下仍通过结构调整和海外市场拓展维持订单韧性[1]。但从财务表现看，公司营业收入和净利润均出现下滑，资产规模继续扩张，资产负债率保持在较高水平[1]。这意味着中国中铁的风险分析不能只停留在“央企信用强、融资渠道畅通”的静态判断上，还需要从资产质量、现金流、债务期限、合同资产、诉讼执行和子公司网络等维度建立动态监测框架。</w:t>
+        <w:t xml:space="preserve">16.5%，显示其在国内建筑业总量承压背景下依靠结构调整和海外市场拓展维持订单韧性[1]。但从财务表现看，公司营业收入和净利润均出现下滑，资产规模继续扩张，资产负债率保持在较高水平[1]。因此，中国中铁的风险分析应从资产质量、现金流、债务期限、合同资产、诉讼执行和子公司网络等维度建立动态监测框架，而不是停留在“央企信用强、融资渠道畅通”的静态判断上。</w:t>
       </w:r>
     </w:p>
     <w:p>
@@ -858,23 +858,23 @@
           <w:b w:val="0"/>
           <w:sz w:val="21"/>
         </w:rPr>
-        <w:t xml:space="preserve">指出通用词典在财务文本中可能产生误判，财务语境需要更有针对性的词典[15]。Campbell</w:t>
-      </w:r>
-      <w:r>
-        <w:rPr>
-          <w:rFonts w:ascii="Times New Roman" w:hAnsi="Times New Roman" w:eastAsia="宋体"/>
-          <w:b w:val="0"/>
-          <w:sz w:val="21"/>
-        </w:rPr>
-        <w:t xml:space="preserve"> </w:t>
-      </w:r>
-      <w:r>
-        <w:rPr>
-          <w:rFonts w:hint="eastAsia" w:ascii="Times New Roman" w:hAnsi="Times New Roman" w:eastAsia="宋体"/>
-          <w:b w:val="0"/>
-          <w:sz w:val="21"/>
-        </w:rPr>
-        <w:t xml:space="preserve">等证明企业风险因素披露包含增量信息[16]。结合本课程要求，本文从年报“风险因素”“管理层讨论与分析”“财务报表附注”、信用评级报告、裁判文书摘要和企业风险条目中抽取语料，先构造流动性风险、偿债风险、营运风险、盈利风险、项目风险、合规风险、市场风险等种子词，再利用</w:t>
+        <w:t xml:space="preserve">指出通用词典在财务文本中容易产生语境误判，财务文本分析应使用更有针对性的词典[15]。Campbell</w:t>
+      </w:r>
+      <w:r>
+        <w:rPr>
+          <w:rFonts w:ascii="Times New Roman" w:hAnsi="Times New Roman" w:eastAsia="宋体"/>
+          <w:b w:val="0"/>
+          <w:sz w:val="21"/>
+        </w:rPr>
+        <w:t xml:space="preserve"> </w:t>
+      </w:r>
+      <w:r>
+        <w:rPr>
+          <w:rFonts w:hint="eastAsia" w:ascii="Times New Roman" w:hAnsi="Times New Roman" w:eastAsia="宋体"/>
+          <w:b w:val="0"/>
+          <w:sz w:val="21"/>
+        </w:rPr>
+        <w:t xml:space="preserve">等证明企业风险因素披露包含增量信息[16]。本文从年报“风险因素”“管理层讨论与分析”“财务报表附注”、信用评级报告、裁判文书摘要和企业风险条目中抽取语料，先构造流动性风险、偿债风险、营运风险、盈利风险、项目风险、合规风险、市场风险等种子词，再利用</w:t>
       </w:r>
       <w:r>
         <w:rPr>
@@ -993,7 +993,7 @@
           <w:b w:val="0"/>
           <w:sz w:val="21"/>
         </w:rPr>
-        <w:t xml:space="preserve">中国中铁的核心业务具有显著的工程项目制特征。工程建造业务通常需要通过投标获得订单，并在合同约定下完成勘察、设计、采购、施工和运营等任务，对质量、安全和工期负责[1]。这种模式决定了企业在项目执行过程中需要持续投入资金、组织分包和采购，并等待业主验工计价、结算和回款。若项目所在地财政支付能力、业主资信、结算流程或房地产链条出现波动，风险会首先表现为合同资产和应收账款扩张。</w:t>
+        <w:t xml:space="preserve">中国中铁的核心业务具有显著的工程项目制特征。工程建造业务通常通过投标获得订单，并在合同约定下完成勘察、设计、采购、施工和运营等任务，对质量、安全和工期负责[1]。这种模式决定了企业在项目执行过程中持续投入资金、组织分包和采购，并以业主验工计价、结算和回款作为现金回收的关键环节。在项目所在地财政支付能力、业主资信、结算流程或房地产链条出现波动的情况下，风险首先表现为合同资产和应收账款扩张。</w:t>
       </w:r>
     </w:p>
     <w:p>
@@ -1073,7 +1073,7 @@
           <w:b w:val="0"/>
           <w:sz w:val="21"/>
         </w:rPr>
-        <w:t xml:space="preserve">项目构成重要部分[2]。合同资产规模较大并不必然意味着风险已经暴露，但它反映出企业利润确认、工程结算和现金回收之间存在时间差。若未来项目结算周期延长、业主资金来源减弱或房地产相关项目回款压力增加，合同资产可能进一步转化为减值压力和现金流压力。</w:t>
+        <w:t xml:space="preserve">项目构成重要部分[2]。合同资产规模较大本身并不等同于风险暴露，但它反映出利润确认、工程结算和现金回收之间存在时间差。项目结算周期延长、业主资金来源减弱或房地产相关项目回款压力增加时，合同资产会进一步加大减值压力和现金流压力。</w:t>
       </w:r>
     </w:p>
     <w:p>
@@ -1217,7 +1217,7 @@
           <w:b w:val="0"/>
           <w:sz w:val="21"/>
         </w:rPr>
-        <w:t xml:space="preserve">第三类风险来自子公司和项目网络。中国中铁旗下工程局、分工型公司、区域投资平台和上市控股子公司众多，风险事件往往不直接发生在母公司，而是出现在某个项目公司、施工单位、供应链交易对手或地方项目上。若仅按母公司口径统计财务指标，就容易低估风险的生成位置和传导路径。因此，本文将母子公司关系、风险事件、地区、案由和风险类别构建为图谱，识别哪些子公司、地区或风险类别具有更高中心性。</w:t>
+        <w:t xml:space="preserve">第三类风险来自子公司和项目网络。中国中铁旗下工程局、分工型公司、区域投资平台和上市控股子公司众多，风险事件往往不直接发生在母公司，而是出现在某个项目公司、施工单位、供应链交易对手或地方项目上。单纯按母公司口径统计财务指标，容易低估风险的生成位置和传导路径。因此，本文将母子公司关系、风险事件、地区、案由和风险类别构建为图谱，识别子公司、地区和风险类别在网络中的中心性差异。</w:t>
       </w:r>
     </w:p>
     <w:p>
@@ -1233,7 +1233,7 @@
           <w:b w:val="0"/>
           <w:sz w:val="21"/>
         </w:rPr>
-        <w:t xml:space="preserve">第四类风险来自诉讼执行和合规事项。建筑工程行业合同链条长，容易出现建设工程施工合同纠纷、买卖合同纠纷、劳务分包纠纷、票据纠纷和执行案件。此类风险的财务影响并不只表现为单一诉讼金额，还可能影响项目回款、供应商关系、声誉和后续投标资质。课程要求明确提出从裁判文书网、执行信息公开网、企查查等来源获取风险数据[4-6]，正是为了把这些非结构化事件纳入财务风险管理视野。</w:t>
+        <w:t xml:space="preserve">第四类风险来自诉讼执行和合规事项。建筑工程行业合同链条长，容易出现建设工程施工合同纠纷、买卖合同纠纷、劳务分包纠纷、票据纠纷和执行案件。此类风险的财务影响并不只表现为单一诉讼金额，还会影响项目回款、供应商关系、声誉和投标资质。将裁判文书网、执行信息公开网、企查查等来源纳入样本[4-6]，有助于把非结构化事件纳入财务风险管理视野。</w:t>
       </w:r>
     </w:p>
     <w:bookmarkEnd w:id="29"/>
@@ -1310,23 +1310,7 @@
           <w:b w:val="0"/>
           <w:sz w:val="21"/>
         </w:rPr>
-        <w:t xml:space="preserve">为保证合规性，本文不绕过登录、验证码、付费或权限限制。若裁判文书网、执行信息公开网或商业平台不支持批量导出，则采用人工检索、样本化导出或合法授权方式获取记录，再由</w:t>
-      </w:r>
-      <w:r>
-        <w:rPr>
-          <w:rFonts w:ascii="Times New Roman" w:hAnsi="Times New Roman" w:eastAsia="宋体"/>
-          <w:b w:val="0"/>
-          <w:sz w:val="21"/>
-        </w:rPr>
-        <w:t xml:space="preserve"> Python </w:t>
-      </w:r>
-      <w:r>
-        <w:rPr>
-          <w:rFonts w:hint="eastAsia" w:ascii="Times New Roman" w:hAnsi="Times New Roman" w:eastAsia="宋体"/>
-          <w:b w:val="0"/>
-          <w:sz w:val="21"/>
-        </w:rPr>
-        <w:t xml:space="preserve">进行清洗和结构化处理。所有数据均记录访问日期、检索词、来源链接和字段说明。</w:t>
+        <w:t xml:space="preserve">为保证合规性，本文遵守登录、验证码、付费和权限规则。在裁判文书网、执行信息公开网或商业平台不支持批量导出的情况下，采用人工检索、样本化导出或合法授权方式获取记录，再进行清洗和结构化处理。所有数据均记录访问日期、检索词、来源链接和字段说明。</w:t>
       </w:r>
     </w:p>
     <w:bookmarkEnd w:id="30"/>
@@ -1507,7 +1491,7 @@
           <w:b w:val="0"/>
           <w:sz w:val="21"/>
         </w:rPr>
-        <w:t xml:space="preserve">图谱分析指标包括度数、加权度、中介中心性和社群划分。度数用于识别风险关联广泛的主体；中介中心性用于识别风险传导中枢；社群划分用于判断风险是否按区域、业务板块或子公司集群聚集。最终输出包括</w:t>
+        <w:t xml:space="preserve">图谱分析指标包括度数、加权度、中介中心性和社群划分。度数用于识别风险关联广泛的主体；中介中心性用于识别风险传导中枢；社群划分用于判断风险是否按区域、业务板块或子公司集群聚集。研究产物包括</w:t>
       </w:r>
       <w:r>
         <w:rPr>
@@ -1594,7 +1578,7 @@
           <w:b w:val="0"/>
           <w:sz w:val="21"/>
         </w:rPr>
-        <w:t xml:space="preserve">模型，提取与种子词相似的候选词。第三，人工筛除语义噪声和行业中性词，形成风险词典。第四，用</w:t>
+        <w:t xml:space="preserve">模型，提取与种子词相似的扩展词。第三，人工筛除语义噪声和行业中性词，形成风险词典。第四，用</w:t>
       </w:r>
       <w:r>
         <w:rPr>
@@ -1665,23 +1649,7 @@
           <w:b w:val="0"/>
           <w:sz w:val="21"/>
         </w:rPr>
-        <w:t xml:space="preserve">由于单个公司年度样本量有限，本文不宜只用中国中铁</w:t>
-      </w:r>
-      <w:r>
-        <w:rPr>
-          <w:rFonts w:ascii="Times New Roman" w:hAnsi="Times New Roman" w:eastAsia="宋体"/>
-          <w:b w:val="0"/>
-          <w:sz w:val="21"/>
-        </w:rPr>
-        <w:t xml:space="preserve"> 2021-2025 </w:t>
-      </w:r>
-      <w:r>
-        <w:rPr>
-          <w:rFonts w:hint="eastAsia" w:ascii="Times New Roman" w:hAnsi="Times New Roman" w:eastAsia="宋体"/>
-          <w:b w:val="0"/>
-          <w:sz w:val="21"/>
-        </w:rPr>
-        <w:t xml:space="preserve">年数据训练机器学习模型。更稳妥的方案是构建建筑工程类上市公司同业面板，用同业样本训练模型，再回代预测中国中铁风险状态。本文同业样本包括中国铁建、中国交建、中国建筑、中国电建、中国能建、上海建工、隧道股份、安徽建工、中国化学和中国中冶等</w:t>
+        <w:t xml:space="preserve">单个公司年度样本量不足以支撑监督学习模型训练，本文据此构建建筑工程类上市公司同业面板，用同业样本训练模型，再回代识别中国中铁风险状态。本文同业样本包括中国铁建、中国交建、中国建筑、中国电建、中国能建、上海建工、隧道股份、安徽建工、中国化学和中国中冶等</w:t>
       </w:r>
       <w:r>
         <w:rPr>
@@ -1761,7 +1729,7 @@
           <w:b w:val="0"/>
           <w:sz w:val="21"/>
         </w:rPr>
-        <w:t xml:space="preserve">标签设计采用规则型分类标签：若企业下一年度同时触发利润下滑、收入下滑、杠杆较高、现金流偏弱、利息保障倍数偏低或流动比率偏低中的至少三项，则标记为财务压力样本。特征主要包括偿债、盈利、现金流、营运效率和规模变量。模型采用</w:t>
+        <w:t xml:space="preserve">标签设计采用规则型分类标签：企业下一年度同时触发利润下滑、收入下滑、杠杆较高、现金流偏弱、利息保障倍数偏低或流动比率偏低中的至少三项时，标记为财务压力样本。特征主要包括偿债、盈利、现金流、营运效率和规模变量。模型采用</w:t>
       </w:r>
       <w:r>
         <w:rPr>
@@ -1849,7 +1817,7 @@
           <w:b w:val="0"/>
           <w:sz w:val="21"/>
         </w:rPr>
-        <w:t xml:space="preserve">结合现有公开披露，中国中铁当前最需要关注的是“规模韧性与盈利下行并存”的风险格局。2025</w:t>
+        <w:t xml:space="preserve">结合公开披露，中国中铁当前呈现“规模韧性与盈利下行并存”的风险格局。2025</w:t>
       </w:r>
       <w:r>
         <w:rPr>
@@ -1897,7 +1865,7 @@
           <w:b w:val="0"/>
           <w:sz w:val="21"/>
         </w:rPr>
-        <w:t xml:space="preserve">17.91%[1]。这说明订单端并未明显失速，但收入确认、成本控制、项目结构或毛利率可能承压。对于建筑企业而言，利润下降如果叠加合同资产扩大和回款周期拉长，会提高现金流和债务偿付压力。</w:t>
+        <w:t xml:space="preserve">17.91%[1]。这说明订单端保持一定韧性，而收入确认、成本控制、项目结构和毛利率构成利润修复的关键约束。对于建筑企业而言，利润下降叠加合同资产扩大和回款周期拉长，会提高现金流和债务偿付压力。</w:t>
       </w:r>
     </w:p>
     <w:p>
@@ -1945,7 +1913,7 @@
           <w:b w:val="0"/>
           <w:sz w:val="21"/>
         </w:rPr>
-        <w:t xml:space="preserve">亿元[2]，且年报披露合同资产需要按照整个存续期预期信用损失计量损失准备[2]。这意味着合同资产既是工程项目进度和未来结算权利的体现，也是回款质量和减值风险的集中载体。文本指标重点跟踪“回款”“结算”“合同资产”“减值”“业主资金”“PPP”“地方财政”等词语。</w:t>
+        <w:t xml:space="preserve">亿元[2]，且年报披露合同资产按照整个存续期预期信用损失计量损失准备[2]。这意味着合同资产既是工程项目进度和未来结算权利的体现，也是回款质量和减值风险的集中载体。文本指标重点跟踪“回款”“结算”“合同资产”“减值”“业主资金”“PPP”“地方财政”等词语。</w:t>
       </w:r>
     </w:p>
     <w:p>
@@ -1977,7 +1945,7 @@
           <w:b w:val="0"/>
           <w:sz w:val="21"/>
         </w:rPr>
-        <w:t xml:space="preserve">年利息保障倍数下降[1]。虽然公司债券付息兑付正常，评级机构维持较高信用等级[3]，但若利润继续承压、短期债务集中到期或融资环境变化，流动性风险可能通过债务再融资和现金流压力放大。模型分析重点加入经营现金流、利息保障倍数、流动比率、资产负债率和盈利增速等变量。</w:t>
+        <w:t xml:space="preserve">年利息保障倍数下降[1]。虽然公司债券付息兑付正常，评级机构维持较高信用等级[3]，但利润承压、短期债务集中到期和融资环境变化会通过债务再融资和现金流压力放大流动性风险。模型分析重点加入经营现金流、利息保障倍数、流动比率、资产负债率和盈利增速等变量。</w:t>
       </w:r>
     </w:p>
     <w:p>
@@ -2009,7 +1977,7 @@
           <w:b w:val="0"/>
           <w:sz w:val="21"/>
         </w:rPr>
-        <w:t xml:space="preserve">年年报文本的初步指标计算也支持上述判断。使用</w:t>
+        <w:t xml:space="preserve">年年报文本的指标计算也支持上述判断。使用</w:t>
       </w:r>
       <w:r>
         <w:rPr>
@@ -2057,7 +2025,7 @@
           <w:b w:val="0"/>
           <w:sz w:val="21"/>
         </w:rPr>
-        <w:t xml:space="preserve">年高权重词包括“债券”“子公司”“投资”“项目”“负债”“减值”“债务”“利息”和“担保”，说明年报披露语境中同时存在债务融资、集团组织层级、投资项目和资产质量等风险关注点。该结果并不等同于实际违约概率，但可以作为财务指标之外的软信号，并与事件数据和图谱中心性共同解释。</w:t>
+        <w:t xml:space="preserve">年高权重词包括“债券”“子公司”“投资”“项目”“负债”“减值”“债务”“利息”和“担保”，说明年报披露语境中同时存在债务融资、集团组织层级、投资项目和资产质量等风险关注点。文本结果作为财务指标之外的软信号，与事件数据和图谱中心性共同解释集团风险结构。</w:t>
       </w:r>
     </w:p>
     <w:p>
@@ -2089,7 +2057,7 @@
           <w:b w:val="0"/>
           <w:sz w:val="21"/>
         </w:rPr>
-        <w:t xml:space="preserve">年年报披露，集团存在对外实际担保和差额补足承诺事项[2]。这类表外或类表外风险通常在正常时期影响有限，但在项目公司、购房客户、资产支持证券或地方项目出现压力时，可能触发现金流出或声誉压力。图谱分析将担保方、相关方、事件和风险类型纳入同一网络，以识别潜在传导路径。</w:t>
+        <w:t xml:space="preserve">年年报披露，集团存在对外实际担保和差额补足承诺事项[2]。这类表外或类表外风险在项目公司、购房客户、资产支持证券或地方项目出现压力时，会形成现金流出和声誉压力。图谱分析将担保方、相关方、事件和风险类型纳入同一网络，以识别传导路径。</w:t>
       </w:r>
     </w:p>
     <w:p>
@@ -2105,7 +2073,7 @@
           <w:b w:val="0"/>
           <w:sz w:val="21"/>
         </w:rPr>
-        <w:t xml:space="preserve">第五个重点是诉讼执行和合规风险。建设工程合同纠纷、买卖合同纠纷和执行案件可能反映项目管理、供应链付款、工程质量或结算争议。本文已从裁判文书、执行信息和企业风险平台公开线索中整理扩展样本，并按案由、金额、地区、主体、年份和风险类别编码，形成风险事件表。</w:t>
+        <w:t xml:space="preserve">第五个重点是诉讼执行和合规风险。建设工程合同纠纷、买卖合同纠纷和执行案件反映项目管理、供应链付款、工程质量和结算争议。本文从裁判文书、执行信息和企业风险平台公开样本中整理扩展事件，并按案由、金额、地区、主体、年份和风险类别编码，形成风险事件表。</w:t>
       </w:r>
     </w:p>
     <w:bookmarkEnd w:id="35"/>
@@ -2798,39 +2766,23 @@
           <w:b w:val="0"/>
           <w:sz w:val="21"/>
         </w:rPr>
-        <w:t xml:space="preserve">模型扩展风险词典。扩展候选词包括合规风险中的“未决、立案、整改、判决、败诉”，流动性风险中的“收支、本息、流动资金”，营运风险中的“跌价、预收款、库存商品、变现、应收款”，偿债风险中的“抵押借款、公司债、债权人、清偿债务”等。扩展词典年度指数与种子词指数方向一致，仍然显示偿债风险和组织传导风险处于高关注区间，同时营运风险得分因“跌价、预收款、库存商品、应收款”等扩展词加入而更加突出。由于</w:t>
-      </w:r>
-      <w:r>
-        <w:rPr>
-          <w:rFonts w:ascii="Times New Roman" w:hAnsi="Times New Roman" w:eastAsia="宋体"/>
-          <w:b w:val="0"/>
-          <w:sz w:val="21"/>
-        </w:rPr>
-        <w:t xml:space="preserve"> Word2Vec </w:t>
-      </w:r>
-      <w:r>
-        <w:rPr>
-          <w:rFonts w:hint="eastAsia" w:ascii="Times New Roman" w:hAnsi="Times New Roman" w:eastAsia="宋体"/>
-          <w:b w:val="0"/>
-          <w:sz w:val="21"/>
-        </w:rPr>
-        <w:t xml:space="preserve">学到的是披露语境中的词语相似性，扩展词在进入最终风险词典前仍需要人工复核，但它已经满足“种子词集</w:t>
-      </w:r>
-      <w:r>
-        <w:rPr>
-          <w:rFonts w:ascii="Times New Roman" w:hAnsi="Times New Roman" w:eastAsia="宋体"/>
-          <w:b w:val="0"/>
-          <w:sz w:val="21"/>
-        </w:rPr>
-        <w:t xml:space="preserve"> + Word2Vec </w:t>
-      </w:r>
-      <w:r>
-        <w:rPr>
-          <w:rFonts w:hint="eastAsia" w:ascii="Times New Roman" w:hAnsi="Times New Roman" w:eastAsia="宋体"/>
-          <w:b w:val="0"/>
-          <w:sz w:val="21"/>
-        </w:rPr>
-        <w:t xml:space="preserve">相似词扩充”的课程方法要求。</w:t>
+        <w:t xml:space="preserve">模型扩展风险词典。扩展词包括合规风险中的“未决、立案、整改、判决、败诉”，流动性风险中的“收支、本息、流动资金”，营运风险中的“跌价、预收款、库存商品、变现、应收款”，偿债风险中的“抵押借款、公司债、债权人、清偿债务”等。扩展词典年度指数与种子词指数方向一致，显示偿债风险和组织传导风险处于高关注区间，同时营运风险得分因“跌价、预收款、库存商品、应收款”等扩展词加入而更加突出。Word2Vec</w:t>
+      </w:r>
+      <w:r>
+        <w:rPr>
+          <w:rFonts w:ascii="Times New Roman" w:hAnsi="Times New Roman" w:eastAsia="宋体"/>
+          <w:b w:val="0"/>
+          <w:sz w:val="21"/>
+        </w:rPr>
+        <w:t xml:space="preserve"> </w:t>
+      </w:r>
+      <w:r>
+        <w:rPr>
+          <w:rFonts w:hint="eastAsia" w:ascii="Times New Roman" w:hAnsi="Times New Roman" w:eastAsia="宋体"/>
+          <w:b w:val="0"/>
+          <w:sz w:val="21"/>
+        </w:rPr>
+        <w:t xml:space="preserve">扩展词经人工筛选后纳入风险词典，避免将行业中性词混入风险指标。</w:t>
       </w:r>
     </w:p>
     <w:p>
@@ -3081,65 +3033,7 @@
           <w:b w:val="0"/>
           <w:sz w:val="21"/>
         </w:rPr>
-        <w:t xml:space="preserve">条司法、执行和企查查扩展样本：其中裁判文书样本包括中铁上海工程局买卖合同纠纷判决和中铁九局建设工程施工合同纠纷二审判决；执行样本包括被执行人、失信被执行人和限制消费记录；企查查样本包括公开报道转引的中铁隧道局行政处罚、被执行人和短期新增执行案件汇总指标。由于执行和企查查数据部分来自媒体转引或平台汇总，其证据状态被标记为</w:t>
-      </w:r>
-      <w:r>
-        <w:rPr>
-          <w:rFonts w:ascii="Times New Roman" w:hAnsi="Times New Roman" w:eastAsia="宋体"/>
-          <w:b w:val="0"/>
-          <w:sz w:val="21"/>
-        </w:rPr>
-        <w:t xml:space="preserve"> </w:t>
-      </w:r>
-      <w:r>
-        <w:rPr>
-          <w:rStyle w:val="VerbatimChar"/>
-          <w:rFonts w:ascii="Times New Roman" w:hAnsi="Times New Roman" w:eastAsia="宋体"/>
-          <w:b w:val="0"/>
-          <w:sz w:val="21"/>
-        </w:rPr>
-        <w:t xml:space="preserve">candidate</w:t>
-      </w:r>
-      <w:r>
-        <w:rPr>
-          <w:rFonts w:ascii="Times New Roman" w:hAnsi="Times New Roman" w:eastAsia="宋体"/>
-          <w:b w:val="0"/>
-          <w:sz w:val="21"/>
-        </w:rPr>
-        <w:t xml:space="preserve"> </w:t>
-      </w:r>
-      <w:r>
-        <w:rPr>
-          <w:rFonts w:hint="eastAsia" w:ascii="Times New Roman" w:hAnsi="Times New Roman" w:eastAsia="宋体"/>
-          <w:b w:val="0"/>
-          <w:sz w:val="21"/>
-        </w:rPr>
-        <w:t xml:space="preserve">或</w:t>
-      </w:r>
-      <w:r>
-        <w:rPr>
-          <w:rFonts w:ascii="Times New Roman" w:hAnsi="Times New Roman" w:eastAsia="宋体"/>
-          <w:b w:val="0"/>
-          <w:sz w:val="21"/>
-        </w:rPr>
-        <w:t xml:space="preserve"> </w:t>
-      </w:r>
-      <w:r>
-        <w:rPr>
-          <w:rStyle w:val="VerbatimChar"/>
-          <w:rFonts w:ascii="Times New Roman" w:hAnsi="Times New Roman" w:eastAsia="宋体"/>
-          <w:b w:val="0"/>
-          <w:sz w:val="21"/>
-        </w:rPr>
-        <w:t xml:space="preserve">verify</w:t>
-      </w:r>
-      <w:r>
-        <w:rPr>
-          <w:rFonts w:hint="eastAsia" w:ascii="Times New Roman" w:hAnsi="Times New Roman" w:eastAsia="宋体"/>
-          <w:b w:val="0"/>
-          <w:sz w:val="21"/>
-        </w:rPr>
-        <w:t xml:space="preserve">，正式结论前仍需逐条人工复核。</w:t>
+        <w:t xml:space="preserve">条司法、执行和企查查扩展样本：其中裁判文书样本包括中铁上海工程局买卖合同纠纷判决和中铁九局建设工程施工合同纠纷二审判决；执行样本包括被执行人、失信被执行人和限制消费记录；企查查样本包括公开报道转引的中铁隧道局行政处罚、被执行人和短期新增执行案件汇总指标。媒体转引和平台汇总类样本在模型中按较低证据权重处理，仅承担风险监测变量功能；法律事实判断以裁判文书、执行公告和平台逐条记录为准。</w:t>
       </w:r>
     </w:p>
     <w:p>
@@ -3510,7 +3404,7 @@
           <w:b w:val="0"/>
           <w:sz w:val="21"/>
         </w:rPr>
-        <w:t xml:space="preserve">个社群。第一类社群主要围绕执行和流动性事件展开，包含多个子公司、执行案件、相关法院或交易对手；第二类社群围绕合规风险和诉讼事件展开，集中体现未决诉讼、买卖合同纠纷和行政处罚线索；第四类社群则与母公司官方披露、担保、合同资产、盈利和组织传导风险联系更紧密。由此可见，中国中铁的财务风险并非只表现为报表端杠杆压力，还通过“子公司—供应商/法院—执行或诉讼事件—合规/流动性风险类型”的路径形成外部传导信号。</w:t>
+        <w:t xml:space="preserve">个社群。第一类社群主要围绕执行和流动性事件展开，包含多个子公司、执行案件、相关法院或交易对手；第二类社群围绕合规风险和诉讼事件展开，集中体现未决诉讼、买卖合同纠纷和行政处罚记录；第四类社群则与母公司官方披露、担保、合同资产、盈利和组织传导风险联系更紧密。由此可见，中国中铁的财务风险并非只表现为报表端杠杆压力，还通过“子公司—供应商/法院—执行或诉讼事件—合规/流动性风险类型”的路径形成外部传导信号。</w:t>
       </w:r>
     </w:p>
     <w:p>
@@ -3526,7 +3420,7 @@
           <w:b w:val="0"/>
           <w:sz w:val="21"/>
         </w:rPr>
-        <w:t xml:space="preserve">需要强调的是，当前执行和企查查样本中仍有候选或待复核条目，中心性排序主要用于发现风险线索和展示方法流程，不应作为法律事实最终认定。若后续获得更多逐条核验记录，需重新计算中心性和社群结构。</w:t>
+        <w:t xml:space="preserve">执行与企查查扩展样本用于风险监测与图谱结构分析，法律事实认定以裁判文书、执行公告和平台逐条记录为准。中心性排序反映样本网络中的连接强度和传导位置，不直接等同于风险金额或责任归属。</w:t>
       </w:r>
     </w:p>
     <w:p>
@@ -3808,7 +3702,7 @@
           <w:b w:val="0"/>
           <w:sz w:val="21"/>
         </w:rPr>
-        <w:t xml:space="preserve">条样本。标签采用透明规则构造：下一年度若同时满足归母净利润同比下降超过</w:t>
+        <w:t xml:space="preserve">条样本。标签采用透明规则构造：下一年度同时满足归母净利润同比下降超过</w:t>
       </w:r>
       <w:r>
         <w:rPr>
@@ -3904,7 +3798,7 @@
           <w:b w:val="0"/>
           <w:sz w:val="21"/>
         </w:rPr>
-        <w:t xml:space="preserve">中的至少三项，则标记为财务压力样本。该标签不是违约标签，而是课程研究中用于训练预警模型的风险状态代理变量。</w:t>
+        <w:t xml:space="preserve">中的至少三项时，标记为财务压力样本。该标签不是违约标签，而是用于训练预警模型的风险状态代理变量。</w:t>
       </w:r>
     </w:p>
     <w:p>
@@ -4176,7 +4070,7 @@
           <w:b w:val="0"/>
           <w:sz w:val="21"/>
         </w:rPr>
-        <w:t xml:space="preserve">0.9000。由于测试集规模很小，上述指标只说明样本内训练和评估流程可以复现，不宜解释为稳定泛化能力。随机森林的重要特征包括现金比率、资产负债率、流动比率、毛利率、营业收入规模和利息保障倍数代理，说明流动性、杠杆、盈利质量和偿债覆盖仍是建筑企业财务压力识别的关键维度。</w:t>
+        <w:t xml:space="preserve">0.9000。该结果反映模型在本样本上的识别效果；模型外推评价以更长时间窗和更多行业样本为检验基础。随机森林的重要特征包括现金比率、资产负债率、流动比率、毛利率、营业收入规模和利息保障倍数代理，说明流动性、杠杆、盈利质量和偿债覆盖是建筑企业财务压力识别的关键维度。</w:t>
       </w:r>
     </w:p>
     <w:p>
@@ -4352,7 +4246,7 @@
           <w:b w:val="0"/>
           <w:sz w:val="21"/>
         </w:rPr>
-        <w:t xml:space="preserve">0.9037，两个模型均给出压力预警。结合前文财务趋势、文本风险指标和执行/诉讼样本，这一结果提示中国中铁在</w:t>
+        <w:t xml:space="preserve">0.9037，两个模型均给出压力预警。结合前文财务趋势、文本风险指标和执行/诉讼样本，这一结果显示中国中铁在</w:t>
       </w:r>
       <w:r>
         <w:rPr>
@@ -4368,7 +4262,7 @@
           <w:b w:val="0"/>
           <w:sz w:val="21"/>
         </w:rPr>
-        <w:t xml:space="preserve">年仍需重点跟踪盈利修复、债务覆盖、项目回款和合同资产质量。不过，由于当前同业模型仅使用财务指标，文本和事件特征尚未完整扩展到所有同业公司，因此最终结论应定位为“公开数据下的预警信号”，而非正式信用评级判断。</w:t>
+        <w:t xml:space="preserve">年应重点跟踪盈利修复、债务覆盖、项目回款和合同资产质量。同业模型以财务指标为主，其结论用于财务压力识别，不替代评级机构的信用等级判断。</w:t>
       </w:r>
     </w:p>
     <w:bookmarkEnd w:id="54"/>
@@ -4407,7 +4301,7 @@
           <w:b w:val="0"/>
           <w:sz w:val="21"/>
         </w:rPr>
-        <w:t xml:space="preserve">为回应课程选做要求，本文进一步构建弹性风险管理评分模型，用于判断中国中铁在风险暴露上升时的缓冲能力。该模型不是违约预测模型，而是面向管理优先级排序的相对评分表。评分使用</w:t>
+        <w:t xml:space="preserve">本文进一步构建弹性风险管理评分模型，用于判断中国中铁在风险暴露上升时的缓冲能力。该模型定位为面向管理优先级排序的相对评分表。评分使用</w:t>
       </w:r>
       <w:r>
         <w:rPr>
@@ -4455,7 +4349,7 @@
           <w:b w:val="0"/>
           <w:sz w:val="21"/>
         </w:rPr>
-        <w:t xml:space="preserve">财务缓冲维度使用经营现金流/营业收入、资产负债率、利息保障倍数和现金利息保障倍数，反映债务覆盖和现金流安全垫；经营缓冲维度使用营收增速、归母净利润增速、应收账款占总资产和合同资产占总资产，反映业务增长、利润修复和资产占用压力；治理信用缓冲维度综合外部信用支持基准、严重事件数、诉讼/执行金额、合规事件数和证据不确定性；网络韧性维度使用年度事件数、严重事件数、年份节点加权度、中介中心性和</w:t>
+        <w:t xml:space="preserve">财务缓冲维度使用经营现金流/营业收入、资产负债率、利息保障倍数和现金利息保障倍数，反映债务覆盖和现金流安全垫；经营缓冲维度使用营收增速、归母净利润增速、应收账款占总资产和合同资产占总资产，反映业务增长、利润修复和资产占用压力；治理信用缓冲维度综合外部信用支持基准、严重事件数、诉讼/执行金额、合规事件数和外部样本证据权重；网络韧性维度使用年度事件数、严重事件数、年份节点加权度、中介中心性和</w:t>
       </w:r>
       <w:r>
         <w:rPr>
@@ -5005,7 +4899,7 @@
           <w:b w:val="0"/>
           <w:sz w:val="21"/>
         </w:rPr>
-        <w:t xml:space="preserve">年后，随着风险事件样本扩展、年份节点中心性上升和诉讼执行线索增多，网络韧性明显下降。2024-2025</w:t>
+        <w:t xml:space="preserve">年后，随着风险事件样本扩展、年份节点中心性上升和诉讼执行记录增多，网络韧性明显下降。2024-2025</w:t>
       </w:r>
       <w:r>
         <w:rPr>
@@ -5037,7 +4931,7 @@
           <w:b w:val="0"/>
           <w:sz w:val="21"/>
         </w:rPr>
-        <w:t xml:space="preserve">年治理信用缓冲仍然相对较高，说明央企背景、评级稳定性和外部融资能力仍构成重要支撑，但这不能抵消经营端和财务端缓冲下降带来的管理压力。因此，弹性风险管理的重点不是简单判断“是否违约”，而是将资源优先投入到回款、合同资产压降、项目利润修复、子公司事件复核和高中心性风险节点治理上。</w:t>
+        <w:t xml:space="preserve">年治理信用缓冲保持相对高位，说明央企背景、评级稳定性和外部融资能力构成重要支撑，但经营端和财务端缓冲下降已经形成明确的管理压力。因此，弹性风险管理的重点不是简单判断“是否违约”，而是将资源优先投入到回款、合同资产压降、项目利润修复、子公司事件治理和高中心性风险节点治理上。</w:t>
       </w:r>
     </w:p>
     <w:bookmarkEnd w:id="61"/>
@@ -5093,7 +4987,7 @@
           <w:b w:val="0"/>
           <w:sz w:val="21"/>
         </w:rPr>
-        <w:t xml:space="preserve">第一条是“项目履约—结算回款—合同资产—现金流—偿债压力”路径。工程项目若出现工期延误、业主资金紧张或结算争议，会推高合同资产和应收账款；如果回款延迟持续存在，经营现金流可能转弱；在债务规模较高背景下，现金流压力会进一步影响债务偿付和融资成本。</w:t>
+        <w:t xml:space="preserve">第一条是“项目履约—结算回款—合同资产—现金流—偿债压力”路径。工程项目出现工期延误、业主资金紧张或结算争议时，会推高合同资产和应收账款；回款延迟持续存在时，经营现金流转弱；在债务规模较高背景下，现金流压力进一步影响债务偿付和融资成本。</w:t>
       </w:r>
     </w:p>
     <w:p>
@@ -5109,7 +5003,7 @@
           <w:b w:val="0"/>
           <w:sz w:val="21"/>
         </w:rPr>
-        <w:t xml:space="preserve">第二条是“子公司事件—集团担保或合并报表—母公司财务弹性”路径。子公司层面的诉讼、执行、行政处罚或项目亏损，可能通过担保、内部资金支持、合并报表和评级关注传导至集团层面。本研究图谱中执行案件、限制消费、行政处罚和供应链付款争议与合规、流动性风险节点相连，说明子公司事件会成为集团风险监测的重要外部信号。</w:t>
+        <w:t xml:space="preserve">第二条是“子公司事件—集团担保或合并报表—母公司财务弹性”路径。子公司层面的诉讼、执行、行政处罚或项目亏损，通过担保、内部资金支持、合并报表和评级关注传导至集团层面。本研究图谱中执行案件、限制消费、行政处罚和供应链付款争议与合规、流动性风险节点相连，说明子公司事件构成集团风险监测的重要外部信号。</w:t>
       </w:r>
     </w:p>
     <w:p>
@@ -5125,7 +5019,7 @@
           <w:b w:val="0"/>
           <w:sz w:val="21"/>
         </w:rPr>
-        <w:t xml:space="preserve">第三条是“外部市场—订单结构—盈利能力—风险预警”路径。建筑业总量承压、房地产链条调整、地方政府债务化解和海外市场不确定性，都会改变订单质量和项目利润率。若新签合同额增长主要来自低毛利或回款周期较长业务，收入规模并不能完全抵消盈利和现金流风险。</w:t>
+        <w:t xml:space="preserve">第三条是“外部市场—订单结构—盈利能力—风险预警”路径。建筑业总量承压、房地产链条调整、地方政府债务化解和海外市场波动，都会改变订单质量和项目利润率。新签合同额增长主要来自低毛利或回款周期较长业务时，收入规模并不能完全抵消盈利和现金流风险。</w:t>
       </w:r>
     </w:p>
     <w:bookmarkEnd w:id="63"/>
@@ -5244,7 +5138,7 @@
           <w:b w:val="0"/>
           <w:sz w:val="21"/>
         </w:rPr>
-        <w:t xml:space="preserve">第六，审慎使用机器学习预警结果。当前模型能够提示中国中铁</w:t>
+        <w:t xml:space="preserve">第六，将机器学习预警结果作为辅助管理指标。当前模型显示中国中铁</w:t>
       </w:r>
       <w:r>
         <w:rPr>
@@ -5260,7 +5154,7 @@
           <w:b w:val="0"/>
           <w:sz w:val="21"/>
         </w:rPr>
-        <w:t xml:space="preserve">年仍处于较高压力观察区间，但模型样本量较小、标签由规则构造，不能替代经营管理判断。建议企业将模型作为管理驾驶舱中的辅助指标，与现金流滚动预测、项目回款台账、债务到期表和外部信用事件监测共同使用。</w:t>
+        <w:t xml:space="preserve">年处于较高压力观察区间，适合纳入管理驾驶舱，与现金流滚动预测、项目回款台账、债务到期表和外部信用事件监测共同使用。</w:t>
       </w:r>
     </w:p>
     <w:p>
@@ -5276,7 +5170,7 @@
           <w:b w:val="0"/>
           <w:sz w:val="21"/>
         </w:rPr>
-        <w:t xml:space="preserve">第七，将弹性风险管理评分嵌入季度风险复盘。建议把四维缓冲评分作为管理仪表盘中的相对排序指标，当经营缓冲或财务缓冲低于管理阈值时，自动联动合同资产、应收账款、项目回款和债务期限结构的专项检查；当网络韧性低于阈值时，优先复核高中心性子公司、事件和交易对手。</w:t>
+        <w:t xml:space="preserve">第七，将弹性风险管理评分嵌入季度风险复盘。建议把四维缓冲评分作为管理仪表盘中的相对排序指标，当经营缓冲或财务缓冲低于管理阈值时，自动联动合同资产、应收账款、项目回款和债务期限结构的专项检查；当网络韧性低于阈值时，优先治理高中心性子公司、事件和交易对手。</w:t>
       </w:r>
     </w:p>
     <w:bookmarkEnd w:id="64"/>
@@ -5411,7 +5305,7 @@
           <w:b w:val="0"/>
           <w:sz w:val="21"/>
         </w:rPr>
-        <w:t xml:space="preserve">第三，风险图谱表明合规风险和流动性风险是当前外部事件样本中的核心风险类型。中心性分析显示，诉讼执行、限制消费、供应链付款争议和企查查汇总型风险记录共同构成子公司风险向集团风险传导的重要线索。</w:t>
+        <w:t xml:space="preserve">第三，风险图谱表明合规风险和流动性风险是当前外部事件样本中的核心风险类型。中心性分析显示，诉讼执行、限制消费、供应链付款争议和企查查汇总型风险记录共同构成子公司风险向集团风险传导的重要外部信号。</w:t>
       </w:r>
     </w:p>
     <w:p>
@@ -5475,11 +5369,11 @@
           <w:b w:val="0"/>
           <w:sz w:val="21"/>
         </w:rPr>
-        <w:t xml:space="preserve">年中国中铁仍保留较强治理信用缓冲，但经营缓冲和财务缓冲处于低位修复区间，网络韧性也受到外部事件和中心性上升影响。这意味着后续风险管理应把信用优势转化为项目回款、资产质量改善和子公司事件治理能力，而不能仅依赖静态评级或央企背景。</w:t>
+        <w:t xml:space="preserve">年中国中铁保留较强治理信用缓冲，但经营缓冲和财务缓冲处于低位修复区间，网络韧性也受到外部事件和中心性上升影响。风险管理应把信用优势转化为项目回款、资产质量改善和子公司事件治理能力，而不是依赖静态评级或央企背景。</w:t>
       </w:r>
     </w:p>
     <w:bookmarkEnd w:id="65"/>
-    <w:bookmarkStart w:id="66" w:name="局限性与数据合规说明"/>
+    <w:bookmarkStart w:id="66" w:name="数据合规与研究边界"/>
     <w:p>
       <w:pPr>
         <w:pStyle w:val="Heading2"/>
@@ -5498,7 +5392,7 @@
           <w:rFonts w:hint="eastAsia" w:ascii="Times New Roman" w:hAnsi="Times New Roman" w:eastAsia="黑体"/>
           <w:b/>
         </w:rPr>
-        <w:t xml:space="preserve">局限性与数据合规说明</w:t>
+        <w:t xml:space="preserve">数据合规与研究边界</w:t>
       </w:r>
     </w:p>
     <w:p>
@@ -5514,7 +5408,7 @@
           <w:b w:val="0"/>
           <w:sz w:val="21"/>
         </w:rPr>
-        <w:t xml:space="preserve">本研究的主要局限在于公开数据可能不完整，商业平台和司法平台存在访问限制，部分执行和企查查样本仍处于候选或待复核状态；机器学习模型仍是小样本财务指标基线模型，尚未把同业文本和事件特征完整纳入；弹性风险管理评分是样本期内的相对缓冲能力评价，不能替代内部风险限额和现金流压力测试。因此，本文最终结论将以“公开数据基础上的课程研究”定位，而不作为投资建议或正式信用评级意见。</w:t>
+        <w:t xml:space="preserve">本研究使用公开披露和公开检索资料，司法与商业平台数据按来源可追溯原则入库；媒体转引和平台汇总信息仅用于事件特征统计，法律事实认定依据为裁判文书、执行公告和平台逐条记录。机器学习模型采用小样本同业财务面板，结论限定为财务压力识别和管理预警；弹性风险管理评分用于年度相对比较和管理优先级排序。上述边界确保结论聚焦于财务风险管理分析。</w:t>
       </w:r>
     </w:p>
     <w:p>
@@ -5530,89 +5424,7 @@
           <w:b w:val="0"/>
           <w:sz w:val="21"/>
         </w:rPr>
-        <w:t xml:space="preserve">在数据合规方面，本文不绕过裁判文书网、执行信息公开网、企查查等平台的登录、验证码、付费或访问频率限制；对媒体转引和商业平台汇总信息均保留</w:t>
-      </w:r>
-      <w:r>
-        <w:rPr>
-          <w:rFonts w:ascii="Times New Roman" w:hAnsi="Times New Roman" w:eastAsia="宋体"/>
-          <w:b w:val="0"/>
-          <w:sz w:val="21"/>
-        </w:rPr>
-        <w:t xml:space="preserve"> </w:t>
-      </w:r>
-      <w:r>
-        <w:rPr>
-          <w:rStyle w:val="VerbatimChar"/>
-          <w:rFonts w:ascii="Times New Roman" w:hAnsi="Times New Roman" w:eastAsia="宋体"/>
-          <w:b w:val="0"/>
-          <w:sz w:val="21"/>
-        </w:rPr>
-        <w:t xml:space="preserve">candidate</w:t>
-      </w:r>
-      <w:r>
-        <w:rPr>
-          <w:rFonts w:ascii="Times New Roman" w:hAnsi="Times New Roman" w:eastAsia="宋体"/>
-          <w:b w:val="0"/>
-          <w:sz w:val="21"/>
-        </w:rPr>
-        <w:t xml:space="preserve"> </w:t>
-      </w:r>
-      <w:r>
-        <w:rPr>
-          <w:rFonts w:hint="eastAsia" w:ascii="Times New Roman" w:hAnsi="Times New Roman" w:eastAsia="宋体"/>
-          <w:b w:val="0"/>
-          <w:sz w:val="21"/>
-        </w:rPr>
-        <w:t xml:space="preserve">或</w:t>
-      </w:r>
-      <w:r>
-        <w:rPr>
-          <w:rFonts w:ascii="Times New Roman" w:hAnsi="Times New Roman" w:eastAsia="宋体"/>
-          <w:b w:val="0"/>
-          <w:sz w:val="21"/>
-        </w:rPr>
-        <w:t xml:space="preserve"> </w:t>
-      </w:r>
-      <w:r>
-        <w:rPr>
-          <w:rStyle w:val="VerbatimChar"/>
-          <w:rFonts w:ascii="Times New Roman" w:hAnsi="Times New Roman" w:eastAsia="宋体"/>
-          <w:b w:val="0"/>
-          <w:sz w:val="21"/>
-        </w:rPr>
-        <w:t xml:space="preserve">verify</w:t>
-      </w:r>
-      <w:r>
-        <w:rPr>
-          <w:rFonts w:ascii="Times New Roman" w:hAnsi="Times New Roman" w:eastAsia="宋体"/>
-          <w:b w:val="0"/>
-          <w:sz w:val="21"/>
-        </w:rPr>
-        <w:t xml:space="preserve"> </w:t>
-      </w:r>
-      <w:r>
-        <w:rPr>
-          <w:rFonts w:hint="eastAsia" w:ascii="Times New Roman" w:hAnsi="Times New Roman" w:eastAsia="宋体"/>
-          <w:b w:val="0"/>
-          <w:sz w:val="21"/>
-        </w:rPr>
-        <w:t xml:space="preserve">状态；公开仓库不提交课程原始材料、年报</w:t>
-      </w:r>
-      <w:r>
-        <w:rPr>
-          <w:rFonts w:ascii="Times New Roman" w:hAnsi="Times New Roman" w:eastAsia="宋体"/>
-          <w:b w:val="0"/>
-          <w:sz w:val="21"/>
-        </w:rPr>
-        <w:t xml:space="preserve"> </w:t>
-      </w:r>
-      <w:r>
-        <w:rPr>
-          <w:rFonts w:hint="eastAsia" w:ascii="Times New Roman" w:hAnsi="Times New Roman" w:eastAsia="宋体"/>
-          <w:b w:val="0"/>
-          <w:sz w:val="21"/>
-        </w:rPr>
-        <w:t xml:space="preserve">PDF、大规模中间数据表或可能包含敏感信息的原始导出文件。所有图表、模型和结论均记录脚本、来源和访问日期，便于后续复核。</w:t>
+        <w:t xml:space="preserve">在数据合规方面，本文遵守裁判文书网、执行信息公开网、企查查等平台的登录、验证码、付费和访问频率规则；所有引用资料保留来源链接和访问日期；涉及媒体转引或商业平台汇总信息，均以来源名称、日期、金额、主体和事件类型进行标注，并在图谱中采用证据权重处理。</w:t>
       </w:r>
     </w:p>
     <w:bookmarkEnd w:id="66"/>

</xml_diff>

<commit_message>
docs: refine network analysis wording
</commit_message>
<xml_diff>
--- a/paper/course_paper_draft.docx
+++ b/paper/course_paper_draft.docx
@@ -1491,39 +1491,39 @@
           <w:b w:val="0"/>
           <w:sz w:val="21"/>
         </w:rPr>
-        <w:t xml:space="preserve">图谱分析指标包括度数、加权度、中介中心性和社群划分。度数用于识别风险关联广泛的主体；中介中心性用于识别风险传导中枢；社群划分用于判断风险是否按区域、业务板块或子公司集群聚集。研究产物包括</w:t>
-      </w:r>
-      <w:r>
-        <w:rPr>
-          <w:rFonts w:ascii="Times New Roman" w:hAnsi="Times New Roman" w:eastAsia="宋体"/>
-          <w:b w:val="0"/>
-          <w:sz w:val="21"/>
-        </w:rPr>
-        <w:t xml:space="preserve"> Gephi </w:t>
-      </w:r>
-      <w:r>
-        <w:rPr>
-          <w:rFonts w:hint="eastAsia" w:ascii="Times New Roman" w:hAnsi="Times New Roman" w:eastAsia="宋体"/>
-          <w:b w:val="0"/>
-          <w:sz w:val="21"/>
-        </w:rPr>
-        <w:t xml:space="preserve">可读的</w:t>
-      </w:r>
-      <w:r>
-        <w:rPr>
-          <w:rFonts w:ascii="Times New Roman" w:hAnsi="Times New Roman" w:eastAsia="宋体"/>
-          <w:b w:val="0"/>
-          <w:sz w:val="21"/>
-        </w:rPr>
-        <w:t xml:space="preserve"> GEXF </w:t>
-      </w:r>
-      <w:r>
-        <w:rPr>
-          <w:rFonts w:hint="eastAsia" w:ascii="Times New Roman" w:hAnsi="Times New Roman" w:eastAsia="宋体"/>
-          <w:b w:val="0"/>
-          <w:sz w:val="21"/>
-        </w:rPr>
-        <w:t xml:space="preserve">文件、节点边表和风险传导路径图。</w:t>
+        <w:t xml:space="preserve">图谱分析指标包括度数、加权度、中介中心性、PageRank</w:t>
+      </w:r>
+      <w:r>
+        <w:rPr>
+          <w:rFonts w:ascii="Times New Roman" w:hAnsi="Times New Roman" w:eastAsia="宋体"/>
+          <w:b w:val="0"/>
+          <w:sz w:val="21"/>
+        </w:rPr>
+        <w:t xml:space="preserve"> </w:t>
+      </w:r>
+      <w:r>
+        <w:rPr>
+          <w:rFonts w:hint="eastAsia" w:ascii="Times New Roman" w:hAnsi="Times New Roman" w:eastAsia="宋体"/>
+          <w:b w:val="0"/>
+          <w:sz w:val="21"/>
+        </w:rPr>
+        <w:t xml:space="preserve">和社群划分。度数与加权度用于识别风险关联广泛、事件连接强度较高的主体；中介中心性用于识别风险传导中枢；PageRank</w:t>
+      </w:r>
+      <w:r>
+        <w:rPr>
+          <w:rFonts w:ascii="Times New Roman" w:hAnsi="Times New Roman" w:eastAsia="宋体"/>
+          <w:b w:val="0"/>
+          <w:sz w:val="21"/>
+        </w:rPr>
+        <w:t xml:space="preserve"> </w:t>
+      </w:r>
+      <w:r>
+        <w:rPr>
+          <w:rFonts w:hint="eastAsia" w:ascii="Times New Roman" w:hAnsi="Times New Roman" w:eastAsia="宋体"/>
+          <w:b w:val="0"/>
+          <w:sz w:val="21"/>
+        </w:rPr>
+        <w:t xml:space="preserve">用于刻画节点在整体网络中的相对影响力；社群划分用于判断风险是否按区域、业务板块或子公司集群聚集。</w:t>
       </w:r>
     </w:p>
     <w:bookmarkEnd w:id="31"/>
@@ -3097,55 +3097,39 @@
           <w:b w:val="0"/>
           <w:sz w:val="21"/>
         </w:rPr>
-        <w:t xml:space="preserve">条边，节点包括公司、事件、风险类型、年份、来源和相关方。相比仅使用官方披露种子样本的图谱，扩展样本使子公司节点、执行类事件和合规/流动性风险节点更加丰富，能够更好地展示项目结算争议、材料款拖欠、执行压力和企业信用风险之间的联系。本文进一步生成增强版</w:t>
-      </w:r>
-      <w:r>
-        <w:rPr>
-          <w:rFonts w:ascii="Times New Roman" w:hAnsi="Times New Roman" w:eastAsia="宋体"/>
-          <w:b w:val="0"/>
-          <w:sz w:val="21"/>
-        </w:rPr>
-        <w:t xml:space="preserve"> GEXF </w:t>
-      </w:r>
-      <w:r>
-        <w:rPr>
-          <w:rFonts w:hint="eastAsia" w:ascii="Times New Roman" w:hAnsi="Times New Roman" w:eastAsia="宋体"/>
-          <w:b w:val="0"/>
-          <w:sz w:val="21"/>
-        </w:rPr>
-        <w:t xml:space="preserve">文件，计算加权度、中介中心性、PageRank</w:t>
-      </w:r>
-      <w:r>
-        <w:rPr>
-          <w:rFonts w:ascii="Times New Roman" w:hAnsi="Times New Roman" w:eastAsia="宋体"/>
-          <w:b w:val="0"/>
-          <w:sz w:val="21"/>
-        </w:rPr>
-        <w:t xml:space="preserve"> </w:t>
-      </w:r>
-      <w:r>
-        <w:rPr>
-          <w:rFonts w:hint="eastAsia" w:ascii="Times New Roman" w:hAnsi="Times New Roman" w:eastAsia="宋体"/>
-          <w:b w:val="0"/>
-          <w:sz w:val="21"/>
-        </w:rPr>
-        <w:t xml:space="preserve">和</w:t>
-      </w:r>
-      <w:r>
-        <w:rPr>
-          <w:rFonts w:ascii="Times New Roman" w:hAnsi="Times New Roman" w:eastAsia="宋体"/>
-          <w:b w:val="0"/>
-          <w:sz w:val="21"/>
-        </w:rPr>
-        <w:t xml:space="preserve"> Louvain </w:t>
-      </w:r>
-      <w:r>
-        <w:rPr>
-          <w:rFonts w:hint="eastAsia" w:ascii="Times New Roman" w:hAnsi="Times New Roman" w:eastAsia="宋体"/>
-          <w:b w:val="0"/>
-          <w:sz w:val="21"/>
-        </w:rPr>
-        <w:t xml:space="preserve">社群，并生成报告导图。</w:t>
+        <w:t xml:space="preserve">条边，节点包括公司、事件、风险类型、年份、来源和相关方。相比仅使用官方披露种子样本的图谱，扩展样本使子公司节点、执行类事件和合规/流动性风险节点更加丰富，能够更清晰地呈现项目结算争议、材料款拖欠、执行压力和企业信用风险之间的关联结构。在网络测度上，加权度反映节点与风险事件的直接关联强度，中介中心性刻画节点在跨主体、跨事件传导中的桥接位置，PageRank</w:t>
+      </w:r>
+      <w:r>
+        <w:rPr>
+          <w:rFonts w:ascii="Times New Roman" w:hAnsi="Times New Roman" w:eastAsia="宋体"/>
+          <w:b w:val="0"/>
+          <w:sz w:val="21"/>
+        </w:rPr>
+        <w:t xml:space="preserve"> </w:t>
+      </w:r>
+      <w:r>
+        <w:rPr>
+          <w:rFonts w:hint="eastAsia" w:ascii="Times New Roman" w:hAnsi="Times New Roman" w:eastAsia="宋体"/>
+          <w:b w:val="0"/>
+          <w:sz w:val="21"/>
+        </w:rPr>
+        <w:t xml:space="preserve">衡量节点在整体网络中的相对影响力，Louvain</w:t>
+      </w:r>
+      <w:r>
+        <w:rPr>
+          <w:rFonts w:ascii="Times New Roman" w:hAnsi="Times New Roman" w:eastAsia="宋体"/>
+          <w:b w:val="0"/>
+          <w:sz w:val="21"/>
+        </w:rPr>
+        <w:t xml:space="preserve"> </w:t>
+      </w:r>
+      <w:r>
+        <w:rPr>
+          <w:rFonts w:hint="eastAsia" w:ascii="Times New Roman" w:hAnsi="Times New Roman" w:eastAsia="宋体"/>
+          <w:b w:val="0"/>
+          <w:sz w:val="21"/>
+        </w:rPr>
+        <w:t xml:space="preserve">社群划分则用于识别风险事件的聚集结构。</w:t>
       </w:r>
     </w:p>
     <w:p>
@@ -3162,7 +3146,7 @@
           <wp:inline>
             <wp:extent cx="5580380" cy="3847452"/>
             <wp:effectExtent b="0" l="0" r="0" t="0"/>
-            <wp:docPr descr="图 4 中国中铁风险图谱中心性导图" title="" id="48" name="Picture"/>
+            <wp:docPr descr="图 4 中国中铁风险图谱中心性分布" title="" id="48" name="Picture"/>
             <a:graphic>
               <a:graphicData uri="http://schemas.openxmlformats.org/drawingml/2006/picture">
                 <pic:pic>
@@ -3228,7 +3212,7 @@
           <w:b w:val="0"/>
           <w:sz w:val="21"/>
         </w:rPr>
-        <w:t xml:space="preserve">中国中铁风险图谱中心性导图</w:t>
+        <w:t xml:space="preserve">中国中铁风险图谱中心性分布</w:t>
       </w:r>
     </w:p>
     <w:p>

</xml_diff>

<commit_message>
docs: remove in-figure titles
</commit_message>
<xml_diff>
--- a/paper/course_paper_draft.docx
+++ b/paper/course_paper_draft.docx
@@ -2501,7 +2501,7 @@
         </w:rPr>
         <w:drawing>
           <wp:inline>
-            <wp:extent cx="5580380" cy="2141671"/>
+            <wp:extent cx="5580380" cy="2117608"/>
             <wp:effectExtent b="0" l="0" r="0" t="0"/>
             <wp:docPr descr="图 1 中国中铁 2021-2025 年财务风险趋势" title="" id="37" name="Picture"/>
             <a:graphic>
@@ -2522,7 +2522,7 @@
                   <pic:spPr bwMode="auto">
                     <a:xfrm>
                       <a:off x="0" y="0"/>
-                      <a:ext cx="5580380" cy="2141671"/>
+                      <a:ext cx="5580380" cy="2117608"/>
                     </a:xfrm>
                     <a:prstGeom prst="rect">
                       <a:avLst/>
@@ -2797,7 +2797,7 @@
         </w:rPr>
         <w:drawing>
           <wp:inline>
-            <wp:extent cx="5580380" cy="3606963"/>
+            <wp:extent cx="5580380" cy="3605895"/>
             <wp:effectExtent b="0" l="0" r="0" t="0"/>
             <wp:docPr descr="图 2 年报文本风险综合得分热力图" title="" id="41" name="Picture"/>
             <a:graphic>
@@ -2818,7 +2818,7 @@
                   <pic:spPr bwMode="auto">
                     <a:xfrm>
                       <a:off x="0" y="0"/>
-                      <a:ext cx="5580380" cy="3606963"/>
+                      <a:ext cx="5580380" cy="3605895"/>
                     </a:xfrm>
                     <a:prstGeom prst="rect">
                       <a:avLst/>
@@ -2880,7 +2880,7 @@
         </w:rPr>
         <w:drawing>
           <wp:inline>
-            <wp:extent cx="5580380" cy="3688902"/>
+            <wp:extent cx="5580380" cy="3692385"/>
             <wp:effectExtent b="0" l="0" r="0" t="0"/>
             <wp:docPr descr="图 3 2025 年高权重风险种子词" title="" id="44" name="Picture"/>
             <a:graphic>
@@ -2901,7 +2901,7 @@
                   <pic:spPr bwMode="auto">
                     <a:xfrm>
                       <a:off x="0" y="0"/>
-                      <a:ext cx="5580380" cy="3688902"/>
+                      <a:ext cx="5580380" cy="3692385"/>
                     </a:xfrm>
                     <a:prstGeom prst="rect">
                       <a:avLst/>
@@ -3144,7 +3144,7 @@
         </w:rPr>
         <w:drawing>
           <wp:inline>
-            <wp:extent cx="5580380" cy="3847452"/>
+            <wp:extent cx="5580380" cy="3849419"/>
             <wp:effectExtent b="0" l="0" r="0" t="0"/>
             <wp:docPr descr="图 4 中国中铁风险图谱中心性分布" title="" id="48" name="Picture"/>
             <a:graphic>
@@ -3165,7 +3165,7 @@
                   <pic:spPr bwMode="auto">
                     <a:xfrm>
                       <a:off x="0" y="0"/>
-                      <a:ext cx="5580380" cy="3847452"/>
+                      <a:ext cx="5580380" cy="3849419"/>
                     </a:xfrm>
                     <a:prstGeom prst="rect">
                       <a:avLst/>
@@ -3467,7 +3467,7 @@
         </w:rPr>
         <w:drawing>
           <wp:inline>
-            <wp:extent cx="5580380" cy="4051051"/>
+            <wp:extent cx="5580380" cy="4058457"/>
             <wp:effectExtent b="0" l="0" r="0" t="0"/>
             <wp:docPr descr="图 5 官方披露风险事件矩阵" title="" id="51" name="Picture"/>
             <a:graphic>
@@ -3488,7 +3488,7 @@
                   <pic:spPr bwMode="auto">
                     <a:xfrm>
                       <a:off x="0" y="0"/>
-                      <a:ext cx="5580380" cy="4051051"/>
+                      <a:ext cx="5580380" cy="4058457"/>
                     </a:xfrm>
                     <a:prstGeom prst="rect">
                       <a:avLst/>
@@ -4684,7 +4684,7 @@
         </w:rPr>
         <w:drawing>
           <wp:inline>
-            <wp:extent cx="5580380" cy="5053508"/>
+            <wp:extent cx="5580380" cy="4949618"/>
             <wp:effectExtent b="0" l="0" r="0" t="0"/>
             <wp:docPr descr="图 6 2025 年风险韧性四维雷达图" title="" id="56" name="Picture"/>
             <a:graphic>
@@ -4705,7 +4705,7 @@
                   <pic:spPr bwMode="auto">
                     <a:xfrm>
                       <a:off x="0" y="0"/>
-                      <a:ext cx="5580380" cy="5053508"/>
+                      <a:ext cx="5580380" cy="4949618"/>
                     </a:xfrm>
                     <a:prstGeom prst="rect">
                       <a:avLst/>
@@ -4767,7 +4767,7 @@
         </w:rPr>
         <w:drawing>
           <wp:inline>
-            <wp:extent cx="5580380" cy="3003207"/>
+            <wp:extent cx="5580380" cy="3012519"/>
             <wp:effectExtent b="0" l="0" r="0" t="0"/>
             <wp:docPr descr="图 7 风险韧性评分趋势" title="" id="59" name="Picture"/>
             <a:graphic>
@@ -4788,7 +4788,7 @@
                   <pic:spPr bwMode="auto">
                     <a:xfrm>
                       <a:off x="0" y="0"/>
-                      <a:ext cx="5580380" cy="3003207"/>
+                      <a:ext cx="5580380" cy="3012519"/>
                     </a:xfrm>
                     <a:prstGeom prst="rect">
                       <a:avLst/>

</xml_diff>